<commit_message>
Enhance TRACE investor protection features and usability
</commit_message>
<xml_diff>
--- a/PRD.docx
+++ b/PRD.docx
@@ -6087,6 +6087,31 @@
           <w:spacing w:val="-2"/>
         </w:rPr>
         <w:t>trustworthy</w:t>
+      </w:r>
+    </w:p>
+    <w:p>
+      <w:r>
+        <w:t>Functional Requirements Implementation Status Matrix (Stage 1, Stage 2 &amp; Stage 3 Verified)</w:t>
+        <w:br/>
+        <w:t>- FR1 Input &amp; PWA Share Target: [IMPLEMENTED] Accepts pasted text, screenshot OCR (Tesseract.js), voice input (Web Speech), 1-click authentic demo scenario chips, and Android PWA Web Share Target (share_target in manifest.json) with EN/HI/TA/TE/BN/MR manual language selector (6 languages: English, Hindi, Tamil, Telugu, Bengali, Marathi).</w:t>
+        <w:br/>
+        <w:t>- FR2 Entity Extraction: [IMPLEMENTED] Extracts SEBI numbers, UPI IDs, phone numbers, URLs, monetary amounts, and sign-off names (e.g. Regards, Kavitha Menon).</w:t>
+        <w:br/>
+        <w:t>- FR3 Rule Engine: [IMPLEMENTED] Evaluates 11 fraud categories across English, Devanagari (Hindi/Marathi), Tamil, Telugu, and Bengali scripts with active negation handling.</w:t>
+        <w:br/>
+        <w:t>- FR4 SEBI Lookup: [IMPLEMENTED] Indexed 3,321 records (Oct 03, 2026 snapshot) supporting FOUND_NAME_MATCH, FOUND_NAME_MISMATCH (impersonation alert), NOT_FOUND, and NONE_CLAIMED.</w:t>
+        <w:br/>
+        <w:t>- FR5 Link Check: [IMPLEMENTED] Identifies direct APKs, URL shorteners, private Telegram/WhatsApp invites, low-cost TLDs, and official vs lookalike domains.</w:t>
+        <w:br/>
+        <w:t>- FR6 LLM Analysis: [IMPLEMENTED] Gemini Flash integration for empathetic analogies and summaries with offline basic check fallback.</w:t>
+        <w:br/>
+        <w:t>- FR7 Risk Aggregation: [IMPLEMENTED] Maps signals into HIGH_RISK, MEDIUM_RISK, LOW_RISK, and CANT_TELL with confidence scores.</w:t>
+        <w:br/>
+        <w:t>- FR8 Explanation, Audio &amp; Judge Bench: [IMPLEMENTED] Localized red flag explanations, character-span phrase highlighting, Everyday Analogy cards, Web Speech API Audio Readout (TTS) in EN, HI, TA, TE, BN, MR (6 languages), and Interactive Judge Test Bench Modal running live 100-case evaluation via /api/benchmark.</w:t>
+        <w:br/>
+        <w:t>- FR9 Safety Wording: [IMPLEMENTED] Strict compliance - no buy/sell advice, non-judgmental tone, and honest registration reporting.</w:t>
+        <w:br/>
+        <w:t>- FR10 Privacy &amp; Interactive Recovery: [IMPLEMENTED] Zero persistence of user messages/OCR images; Interactive Recovery Complaint Generator dynamically formats user-entered transaction data (Amount, Bank, UTR, Date, Suspect) without permanent financial data storage.</w:t>
       </w:r>
     </w:p>
     <w:p>

</xml_diff>